<commit_message>
Pass 8 True 1-Click Easy Apply — fix url_of bug, regenerate 120 subpages, 242 docx, 120 kits, bulk ZIPs, screening tailored, ATS_GUIDE, bookmarklet, extension draft, master JSON, sitemap 121, verification log Pass 8
Co-authored-by: arena-agent <297053741+arena-agent@users.noreply.github.com>
</commit_message>
<xml_diff>
--- a/assets/docx/Brian_Chemistry_Resume.docx
+++ b/assets/docx/Brian_Chemistry_Resume.docx
@@ -4,10 +4,6 @@
   <w:body>
     <w:p>
       <w:r>
-        <w:rPr>
-          <w:b/>
-          <w:sz w:val="22"/>
-        </w:rPr>
         <w:t>BRIAN</w:t>
       </w:r>
     </w:p>
@@ -19,10 +15,6 @@
     <w:p/>
     <w:p>
       <w:r>
-        <w:rPr>
-          <w:b/>
-          <w:sz w:val="22"/>
-        </w:rPr>
         <w:t>SUMMARY</w:t>
       </w:r>
     </w:p>
@@ -59,10 +51,6 @@
     <w:p/>
     <w:p>
       <w:r>
-        <w:rPr>
-          <w:b/>
-          <w:sz w:val="22"/>
-        </w:rPr>
         <w:t>CORE LABORATORY SKILLS</w:t>
       </w:r>
     </w:p>
@@ -134,19 +122,11 @@
     <w:p/>
     <w:p>
       <w:r>
-        <w:rPr>
-          <w:b/>
-          <w:sz w:val="22"/>
-        </w:rPr>
         <w:t>LABORATORY EXPERIENCE</w:t>
       </w:r>
     </w:p>
     <w:p>
       <w:r>
-        <w:rPr>
-          <w:b/>
-          <w:sz w:val="21"/>
-        </w:rPr>
         <w:t>Lab Assistant - Quintara Biosciences, San Francisco Bay Area - Jan 2012 to May 2012</w:t>
       </w:r>
     </w:p>
@@ -173,10 +153,6 @@
     <w:p/>
     <w:p>
       <w:r>
-        <w:rPr>
-          <w:b/>
-          <w:sz w:val="21"/>
-        </w:rPr>
         <w:t>Lab Intern - MicroConstants, San Diego, CA - Aug 2011 to Dec 2011</w:t>
       </w:r>
     </w:p>
@@ -198,10 +174,6 @@
     <w:p/>
     <w:p>
       <w:r>
-        <w:rPr>
-          <w:b/>
-          <w:sz w:val="21"/>
-        </w:rPr>
         <w:t>Summer Medicinal Chemistry Intern - Threshold Pharmaceuticals, San Francisco Bay Area - Jun 2011 to Aug 2011</w:t>
       </w:r>
     </w:p>
@@ -223,19 +195,11 @@
     <w:p/>
     <w:p>
       <w:r>
-        <w:rPr>
-          <w:b/>
-          <w:sz w:val="22"/>
-        </w:rPr>
         <w:t>ADDITIONAL EXPERIENCE</w:t>
       </w:r>
     </w:p>
     <w:p>
       <w:r>
-        <w:rPr>
-          <w:b/>
-          <w:sz w:val="21"/>
-        </w:rPr>
         <w:t>Property Manager (contract) - San Francisco, CA - May 2012 to present</w:t>
       </w:r>
     </w:p>
@@ -267,10 +231,6 @@
     <w:p/>
     <w:p>
       <w:r>
-        <w:rPr>
-          <w:b/>
-          <w:sz w:val="22"/>
-        </w:rPr>
         <w:t>EDUCATION</w:t>
       </w:r>
     </w:p>
@@ -297,10 +257,6 @@
     <w:p/>
     <w:p>
       <w:r>
-        <w:rPr>
-          <w:b/>
-          <w:sz w:val="22"/>
-        </w:rPr>
         <w:t>PUBLICATION</w:t>
       </w:r>
     </w:p>
@@ -688,10 +644,6 @@
     <w:name w:val="Normal"/>
     <w:qFormat/>
     <w:rsid w:val="00FC693F"/>
-    <w:rPr>
-      <w:rFonts w:ascii="Calibri" w:hAnsi="Calibri"/>
-      <w:sz w:val="21"/>
-    </w:rPr>
   </w:style>
   <w:style w:type="paragraph" w:styleId="Header">
     <w:name w:val="header"/>

</xml_diff>